<commit_message>
Incorporate improved sublease cleanup from review agents
Pages 14-20 significantly refined by later-completing review agent.
Minor improvements across pages 1-13 from overlapping agent work.
Sublease Word document rebuilt with all improvements.

https://claude.ai/code/session_01BKUuQUqscRFSnXdaV7eTvz
</commit_message>
<xml_diff>
--- a/output/20 Hornton Street Flat 1 Sublease to Newnhams -- 1973.docx
+++ b/output/20 Hornton Street Flat 1 Sublease to Newnhams -- 1973.docx
@@ -32,7 +32,13 @@
     <w:p>
       <w:pPr/>
       <w:r>
-        <w:t>Title No: Property: 20 Hornton Street, Flat 1, London W8</w:t>
+        <w:t>Title No:</w:t>
+      </w:r>
+    </w:p>
+    <w:p>
+      <w:pPr/>
+      <w:r>
+        <w:t>Property: Flat 1, 20 Hornton Street, London W8</w:t>
       </w:r>
     </w:p>
     <w:p>
@@ -50,7 +56,7 @@
     <w:p>
       <w:pPr/>
       <w:r>
-        <w:t>IN this Lease and the Schedules hereto the following expressions shall where the context so admits have the meanings hereby given respectively</w:t>
+        <w:t>1. IN this Lease and the Schedules hereto the following expressions shall where the context so admits have the meanings hereby given respectively</w:t>
       </w:r>
     </w:p>
     <w:p>
@@ -74,13 +80,7 @@
     <w:p>
       <w:pPr/>
       <w:r>
-        <w:t>(iv) "the demised premises" shall mean those parts of which are hereby demised and are described in the First Schedule hereto</w:t>
-      </w:r>
-    </w:p>
-    <w:p>
-      <w:pPr/>
-      <w:r>
-        <w:t>the Lessor's property</w:t>
+        <w:t>(iv) "the demised premises" shall mean those parts of the Lessor's property which are hereby demised and are described in the First Schedule hereto</w:t>
       </w:r>
     </w:p>
     <w:p>
@@ -103,13 +103,13 @@
     <w:p>
       <w:pPr/>
       <w:r>
-        <w:t>(vii) "the Building" shall mean the Building known as 20 Hornton Street aforesaid of which the demised premises form part</w:t>
+        <w:t>(vii) "the Building" shall mean the building known as 20 Hornton Street aforesaid of which the demised premises form part</w:t>
       </w:r>
     </w:p>
     <w:p>
       <w:pPr/>
       <w:r>
-        <w:t>(viii) "the Lessor's property" shall mean the Land house and other buildings and erections (if any) comprised in the Lessor's Title No. LN90715</w:t>
+        <w:t>(viii) "the Lessor's property" shall mean the land house and other buildings and erections (if any) comprised in the Lessor's Title No. LN60715</w:t>
       </w:r>
     </w:p>
     <w:p>
@@ -139,12 +139,18 @@
     <w:p>
       <w:pPr/>
       <w:r>
-        <w:t>2. IN consideration of the sum of TWENTY-THREE THOUSAND AND SEVEN HUNDRED AND FIFTY POUNDS (£23,750) paid by the Lessee to the Lessor (the receipt whereof the Lessor hereby acknowledges) and of the rent and covenants on the part of the Lessee and conditions hereinafter reserved and contained the Lessor hereby demises unto the Lessee ALL the demised premises TOGETHER WITH the rights set forth in the Second Schedule hereto TO HOLD unto the Lessee for a term (hereinafter called "the said term") commencing the day of 1973 and expiring on the 19th day of March 2002 (determinable nevertheless as hereinafter provided) subject to the rights set out in the Third Schedule hereto (which are hereby excepted and reserved out of this demise) paying therefor during the said term the yearly rent of £150 and the further and additional rent mentioned to be paid by equal quarterly payments in advance on the usual quarter days in every year the</w:t>
+        <w:t>2. IN consideration of the sum of TWENTY-THREE THOUSAND AND SEVEN HUNDRED AND FIFTY POUNDS (£23,750) now paid by the Lessee to the Lessor (the receipt whereof the Lessor hereby acknowledges) and of the rent and covenants on the part of the Lessee and conditions hereinafter reserved and contained the Lessor hereby demises unto the Lessee ALL the demised premises TOGETHER WITH the rights set out in the Second Schedule hereto TO HOLD unto the Lessee for a term (hereinafter called "the said term") commencing the day of 1973 and expiring on the 19th day of March 2002 (determinable nevertheless as hereinafter provided) subject to the rights set out in the Third Schedule hereto (which are hereby excepted and reserved out of this demise) paying therefor during the said term the yearly rent of £150 and the further and additional rent mentioned to be paid by equal quarterly payments on the usual quarter days in every year hereinafter</w:t>
       </w:r>
     </w:p>
     <w:p>
       <w:r>
         <w:br w:type="page"/>
+      </w:r>
+    </w:p>
+    <w:p>
+      <w:pPr/>
+      <w:r>
+        <w:t>3. THE Lessee for himself and his assigns to the intent that the obligations may continue throughout the said term hereby covenants with the Lessor as follows that is to say:-</w:t>
       </w:r>
     </w:p>
     <w:p>
@@ -156,7 +162,7 @@
     <w:p>
       <w:pPr/>
       <w:r>
-        <w:t>(2) To pay to the Lessor without any deduction by way of further and additional rent one third of the expenses and outgoings incurred by the Lessor in the repair maintenance renewal and insurance of the Lessor's property and the provision of services therein and other the performance by the Lessor of his obligations in this Underlease set forth and the other heads of expenditure as the same are set out in the Fifth Schedule hereto such further and additional rent subject to the following terms and provisions: (hereinafter called "the service charge") being</w:t>
+        <w:t>(2) To pay to the Lessor without any deduction by way of further and additional rent one third of the expenses and outgoings incurred by the Lessor in the repair maintenance renewal and insurance of the Lessor's property and the provision of services therein and other the performance by the Lessor of his obligations in this Underlease set forth and the other heads of expenditure as the same are set out in the Fifth Schedule hereto such further and additional rent (hereinafter called "the service charge") being subject to the following terms and provisions:</w:t>
       </w:r>
     </w:p>
     <w:p>
@@ -174,19 +180,13 @@
     <w:p>
       <w:pPr/>
       <w:r>
-        <w:t>(c) the Certificate shall contain a summary of the Lessor's said expenses and outgoings incurred during the year of accounting to which it relates together with a summary of the relevant net figures forming the basis of the service charge the Certificate (or a copy thereof duly certified by the person by whom the same was given) shall be conclusive evidence for the purposes of the matters which it purports to certify</w:t>
+        <w:t>(c) the Certificate shall contain a summary of the Lessor's said expenses and outgoings incurred during the year of accounting to which it relates together with a summary of the relevant net figures forming the basis of the service charge the Certificate (or a copy thereof duly certified by the person by whom the same was given) shall be conclusive evidence for the purposes hereof of the matters which it purports to certify</w:t>
       </w:r>
     </w:p>
     <w:p>
       <w:pPr/>
       <w:r>
-        <w:t>(d) the Lessee shall if required by the Lessor pay to the Lessor such sum in advance and on account with every quarterly payment of rent reserved hereunder first whereof is to be paid on the execution hereof and both to be apportioned (if necessary) in respect of the period from the day of 1973 to the quarter day next hereafter</w:t>
-      </w:r>
-    </w:p>
-    <w:p>
-      <w:pPr/>
-      <w:r>
-        <w:t>THE Lessee for himself and his assigns to the intent that the obligations may continue throughout the said term hereby covenants with the Lessor as follows that is to say:-</w:t>
+        <w:t>(d) the Lessee shall if required by the Lessor with every quarterly payment of rent reserved hereunder pay to the Lessor such sum in advance and on account first whereof is to be paid on the execution hereof and both to be apportioned (if necessary) in respect of the period from the day of to the quarter day next hereafter</w:t>
       </w:r>
     </w:p>
     <w:p>
@@ -209,7 +209,7 @@
     <w:p>
       <w:pPr/>
       <w:r>
-        <w:t>(f) the expression "the expenses and outgoings incurred by the Lessor" as hereinbefore used shall be deemed to include not only those expenses outgoings and other expenditure hereinbefore described which have been actually disbursed incurred or made by the Lessor during the year in question but also such reasonable part of all such expenses outgoings and other expenditure hereinbefore described which are of a periodically recurring nature (whether recurring by regular or irregular periods) whenever disbursed incurred or made and whether prior to the commencement of the said term or otherwise including a sum of money by way of reasonable provision for anticipated expenditure in respect thereof as the Lessor his Accountants or Managing Agents (as the case may be) may in their discretion allocate to the period in question as being fair and reasonable in the circumstances</w:t>
+        <w:t>(f) the expression "the expenses and outgoings incurred by the Lessor" as hereinbefore used shall be deemed to include not only those expenses outgoings and other expenditure hereinbefore described which have been actually disbursed incurred or made by the Lessor during the year of accounting in question but also such reasonable part of all such expenses outgoings and other expenditure hereinbefore described which are of a periodically recurring nature (whether recurring by regular or irregular periods) whenever disbursed incurred or made and whether prior to the commencement of the said term or otherwise including a sum of money by way of reasonable provision for anticipated expenditure in respect thereof as the Lessor his Accountants or Managing Agents (as the case may be) may in their discretion allocate to the period in question as being fair and reasonable in the circumstances</w:t>
       </w:r>
     </w:p>
     <w:p>
@@ -244,7 +244,7 @@
     <w:p>
       <w:pPr/>
       <w:r>
-        <w:t>(4) To pay all charges for gas and electricity supplied to the demised premises as shown by separate meters and the charges for such meters provided therefor and to indemnify the Lessor in respect thereof</w:t>
+        <w:t>(4) To pay all charges for gas and electricity supplied to the demised premises as shown by separate meters and the charges for such meters and to indemnify the Lessor in respect thereof</w:t>
       </w:r>
     </w:p>
     <w:p>
@@ -279,7 +279,7 @@
     <w:p>
       <w:pPr/>
       <w:r>
-        <w:t>(7) (a) To pay to the Lessor all costs charges and expenses (including legal costs and fees payable to a surveyor) which may be incurred by the Lessor incidental to the preparation and service of a notice under Section 146 of the Law of Property Act 1925 or incurred in or in contemplation of proceedings under Sections 146 or 147 of that Act notwithstanding that forfeiture may be avoided otherwise than by relief granted by the Court</w:t>
+        <w:t>(7) (a) To pay to the Lessor all costs charges and expenses (including legal costs and fees payable to a surveyor) which may be incurred by the Lessor incidental to the preparation and service of a notice under Section 146 of the Law of Property Act 1925 or incurred in or in contemplation of proceedings under Sections 146 or 147 of that Act notwithstanding forfeiture may be avoided otherwise than by relief granted by the Court</w:t>
       </w:r>
     </w:p>
     <w:p>
@@ -297,12 +297,6 @@
     <w:p>
       <w:r>
         <w:br w:type="page"/>
-      </w:r>
-    </w:p>
-    <w:p>
-      <w:pPr/>
-      <w:r>
-        <w:t>Lessor</w:t>
       </w:r>
     </w:p>
     <w:p>
@@ -331,13 +325,19 @@
     <w:p>
       <w:pPr/>
       <w:r>
+        <w:t>Lessors and their Agents from time to time during notice in writing of all defects decays and wants</w:t>
+      </w:r>
+    </w:p>
+    <w:p>
+      <w:pPr/>
+      <w:r>
         <w:t>(12) At the end or sooner determination of the said term quietly to surrender and yield up the demised premises to the Lessor or as he may direct with the improvements additions and fixtures so repaired maintained cleansed amended painted decorated and renewed and in such good and substantial repair and condition in all things as shall be in accordance with the covenants and conditions on the part of the Lessee herein contained and any disputes or difference then arising as to the state of repair of the demised premises or as to the monies to be paid by the Lessee in respect of any want of repair shall if so required by the Lessor be referred to the arbitration of independent Architects or Surveyors in accordance with the Arbitration Acts then in force</w:t>
       </w:r>
     </w:p>
     <w:p>
       <w:pPr/>
       <w:r>
-        <w:t>(13) To permit the Lessor and any person authorised by him on giving 48 hours previous notice in writing (except in case of emergency) at all reasonable times during the said term to permit the Superior Lessors and their Agents from time to time during the said term to enter upon the demised premises or any part thereof for the purposes of viewing the condition and mode of user thereof and to take schedules of the fixtures and fittings thereon and for other reasonable purposes and to give to or to leave upon the demised premises for the Lessee a notice in writing of all defects decays and wants of repair in breach of the covenants on the part of the Lessee herein contained or removal of fixtures there found and the Lessee will with all proper despatch and in any case within two months then next following well and sufficiently repair and amend and restore the demised premises accordingly and will pay and discharge on demand all costs charges and expenses (including legal costs and any fees payable to a surveyor) incurred by the Lessor or his Agents of and incidental to the preparation and service of such last mentioned notice or of any statutory notice relating to any breach of covenant PROVIDED ALWAYS that in case of any default in the performance of the foregoing covenant it shall be lawful for the Lessor (but without prejudice to any other right or remedy) to enter upon the demised premises and repair or put in order the same or</w:t>
+        <w:t>(13) To permit the Lessor and any person authorised by him on giving 48 hours previous notice in writing (except in case of emergency) at all reasonable times during the said term to permit the Superior Lessors and their Agents from time to time during the said term to enter upon the demised premises or any part thereof for the purposes of viewing the condition and mode of user thereof and to take schedules of the fixtures and fittings thereon and for other reasonable purposes and to give to or to leave upon the demised premises for the Lessee a notice of repair in breach of the covenants on the part of the Lessee herein contained or removal of fixtures there found and the Lessee will with all proper despatch and in any case within two months then next following well and sufficiently repair and amend and restore the demised premises accordingly and will pay and discharge on demand all costs charges and expenses (including legal costs and any fees payable to a surveyor) incurred by the Lessor or his Agents of and incidental to the preparation and service of such last mentioned notice or of any statutory notice relating to any breach of covenant PROVIDED ALWAYS that in case of any default in the performance of the foregoing covenant it shall be lawful for the Lessor (but without prejudice to any other right or remedy) to enter upon the demised premises and repair or put in order the same or</w:t>
       </w:r>
     </w:p>
     <w:p>
@@ -360,7 +360,7 @@
     <w:p>
       <w:pPr/>
       <w:r>
-        <w:t>(15) Not to carry on or permit upon the demised premises or any part thereof any trade business or occupation whatsoever nor to do or suffer to be done thereon or upon any part of the Lessor's property any other thing which may be or become a nuisance annoyance or inconvenience to the Lessor or to the owners lessees or occupiers of other parts of the Lessor's property or of any neighbouring property or whereby any insurance effected by the Lessor or the Superior Lessors may be rendered void or whereby the rate of premium may be increased nor to use the demised premises or any part thereof nor allow the same to be used for any illegal or immoral purpose nor to hold therein or thereon any sale by auction PROVIDED that the whole and every part of the demised premises shall at all times during the said term be used for the purpose of a high class private residence with private patio in the occupation of one family only the expression "family" having its English meaning and so that the demised premises or the occupation thereof shall in no circumstances be shared PROVIDED however that nothing herein contained shall imply or be deemed to be a warranty that the demised premises may in accordance with the Town &amp; County Planning laws and regulations now or from time to time in force be used for the purpose above mentioned</w:t>
+        <w:t>(15) Not to carry on or permit upon the demised premises or any part thereof any trade business or occupation whatsoever nor to do or suffer to be done thereon or upon any part of the Lessor's property any other thing which may be or become a nuisance annoyance or inconvenience to the Lessor or to the owners lessees or occupiers of other parts of the Lessor's property or of any neighbouring property or whereby any insurance effected by the Lessor or the Superior Lessors may be rendered void or whereby the rate of premium may be increased nor to use the demised premises or any part thereof nor allow the same to be used for any illegal or immoral purpose nor to hold therein or thereon any sale by auction but that the whole and every part of the demised premises shall at all times during the said term be used for the purpose of a high class private residence with private patio in the occupation of one family only the expression "family" having its English meaning and so that the demised premises or the occupation thereof shall in no circumstances be shared PROVIDED however that nothing herein contained shall imply or be deemed to be a warranty that the demised premises may in accordance with the Town and County Planning laws and regulations now or from time to time in force be used for the purpose above mentioned</w:t>
       </w:r>
     </w:p>
     <w:p>
@@ -395,7 +395,7 @@
     <w:p>
       <w:pPr/>
       <w:r>
-        <w:t>(19) (a) Not to carry out or permit or suffer to be carried out any "development" in the demised premises within the meaning of the legislation for the time being in force as to Town &amp; Country Planning</w:t>
+        <w:t>(19) (a) Not to carry out or permit or suffer to be carried out any "development" on the demised premises within the meaning of the legislation for the time being in force as to Town &amp; Country Planning</w:t>
       </w:r>
     </w:p>
     <w:p>
@@ -447,13 +447,13 @@
     <w:p>
       <w:pPr/>
       <w:r>
-        <w:t>(c) Not at any time to assign sub-let or part with possession of or permit any sub-tenant to under-let or part with possession of the demised premises at an annual rent less than the rents hereby reserved inclusive of all outgoings</w:t>
+        <w:t>possession of or permit any sub-tenant to under-let or part with possession of the demised premises at an annual rent less than the rents hereby reserved inclusive of all outgoings</w:t>
       </w:r>
     </w:p>
     <w:p>
       <w:pPr/>
       <w:r>
-        <w:t>(d) Within one calendar month after any such document or instrument as is hereinafter mentioned shall be executed or shall operate or take effect or purport to operate or take effect to produce to the Lessor's Solicitors every Transfer Mortgage or Legal Charge of this Underlease or the demised premises or any part thereof and also every sub-Underlease thereof and every assignment of such sub-Underlease and also every Probate Letters of Administration Order of Court or other instrument effecting or evidencing a devolution of title as regards the said term or any such sub- Underlease as aforesaid for the purpose of registration and on every such registration to pay to such Solicitors a fee of Five Pounds (£5) in respect of each such document or instrument so produced</w:t>
+        <w:t>(c) Within one calendar month after any such document or instrument as is hereinafter mentioned shall be executed or shall operate or take effect or purport to operate or take effect to produce to the Lessor's Solicitors every Transfer Mortgage or Legal Charge of this Underlease or the demised premises or any part thereof and also every sub-Underlease thereof and every assignment of such sub-Underlease and also every Probate Letters of Administration Order of Court or other instrument effecting or evidencing a devolution of title as regards the said term or any such sub- Underlease as aforesaid for the purpose of registration and on every such registration to pay to such Solicitors a fee of Five Pounds (£5) in respect of each such document or instrument so produced</w:t>
       </w:r>
     </w:p>
     <w:p>
@@ -518,7 +518,7 @@
     <w:p>
       <w:pPr/>
       <w:r>
-        <w:t>4. PROVIDED ALWAYS and it is hereby agreed that if the said rents or any part thereof shall be unpaid for twenty-one days next after becoming payable (whether the same shall have been formally demanded or not) or if the Lessee shall not duly perform or observe all the covenants and provisions hereby on the part of the Lessee to be performed or observed and notwithstanding any waiver by the Lessor of any previous non-payment of rent or breach or non- performance of any such covenant agreement or condition</w:t>
+        <w:t>PROVIDED ALWAYS and it is hereby agreed that if the said rents or any part thereof shall be unpaid for twenty-one days next after becoming payable (whether the same shall have been formally demanded or not) or if the Lessee shall not duly perform or observe all the covenants and provisions hereby on the part of the Lessee to be performed or observed and notwithstanding any waiver by the Lessor of any previous non-payment of rent or breach or non- performance of any such covenant agreement or condition</w:t>
       </w:r>
     </w:p>
     <w:p>
@@ -529,37 +529,37 @@
     <w:p>
       <w:pPr/>
       <w:r>
-        <w:t>it shall be lawful for the Lessor or any person or persons duly authorised by the Lessor in that behalf to re-enter into or upon the demised premises or any part thereof in the name of the whole and to re-possess and enjoy the same as if this Lease had not been made but without prejudice to any right of action or remedy of the Lessor in respect of any antecedent breach of any of the covenants by the Lessee herein contained</w:t>
+        <w:t>then and in such case it shall be lawful for the Lessor or any person or persons duly authorised by the Lessor in that behalf to re-enter into or upon the demised premises or any part thereof in the name of the whole and to re-possess and enjoy the same as if this Lease had not been made but without prejudice to any right of action or remedy of the Lessor in respect of any antecedent breach of any of the covenants by the Lessee herein contained</w:t>
       </w:r>
     </w:p>
     <w:p>
       <w:pPr/>
       <w:r>
-        <w:t>5 THE Lessor hereby covenants with the Lessee subject to the payment by the Lessee of the rents and the service charge and PROVIDED THAT the Lessee has complied with all the covenants agreements and obligations on his part to be performed and observed (and this covenant is subject to such payment and observance as a condition precedent)</w:t>
+        <w:t>5. THE Lessor hereby covenants with the Lessee that subject to the payment by the Lessee of the rents and the service charge and PROVIDED THAT the Lessee has complied with all the covenants agreements and obligations on his part to be performed and observed (and this covenant is subject to such payment and observance as a condition precedent)</w:t>
       </w:r>
     </w:p>
     <w:p>
       <w:pPr/>
       <w:r>
-        <w:t>(i) The Lessor will at all times during the term maintain in good repair and condition and decoration:-</w:t>
+        <w:t>(i) The Lessor will at all times during the said term maintain in good repair and condition of repair and decoration:-</w:t>
       </w:r>
     </w:p>
     <w:p>
       <w:pPr/>
       <w:r>
-        <w:t>(a) the main structure and in particular foundations roofs external walls of the building</w:t>
+        <w:t>(a) the main structure and in particular the foundations roofs external walls of the building</w:t>
       </w:r>
     </w:p>
     <w:p>
       <w:pPr/>
       <w:r>
-        <w:t>(b) all pipes wires ducts conduits tanks drains and sewers the Lessor's property other than such as exclusively serve the demised premises</w:t>
+        <w:t>(b) all pipes wires ducts conduits tanks drains and sewers in or upon the Lessor's property other than such as exclusively serve the demised premises</w:t>
       </w:r>
     </w:p>
     <w:p>
       <w:pPr/>
       <w:r>
-        <w:t>(c) the entrance entrance hall passages landings and staircases of the building or enjoyed by the Lessee in common with the Lessees and occupiers of other parts of the building or used or enjoyed in common by all or any of the Lessees or occupiers of other parts of the building</w:t>
+        <w:t>(c) the entrance entrance hall passages landings and staircases of the building or enjoyed by the Lessee in common with the Lessees and occupiers of other parts of the building or used or enjoyed in common by two or all of the Lessees or occupiers of other parts of the building</w:t>
       </w:r>
     </w:p>
     <w:p>
@@ -577,7 +577,7 @@
     <w:p>
       <w:pPr/>
       <w:r>
-        <w:t>(ii) The Lessor will pay and discharge all existing and future rates (including water taxes and assessments and outgoings whatsoever whether parliamentary parochial local or other description which now are or may at any time hereafter during the said term be</w:t>
+        <w:t>(ii) The Lessor will pay and discharge all existing and future rates (including water rates) taxes and assessments and outgoings whatsoever whether parliamentary parochial local or of any other description which now are or may hereafter be imposed or charged during the said</w:t>
       </w:r>
     </w:p>
     <w:p>
@@ -588,25 +588,19 @@
     <w:p>
       <w:pPr/>
       <w:r>
-        <w:t>payable in respect of the Lessor's property or any part thereof or on any person having control thereof other than such as are separately assessed in respect of the demised premises or any part thereof or on the owner or occupier thereof</w:t>
+        <w:t>term charged imposed assessed or payable in respect of the Lessor's property or any part thereof or on any person having control or ownership thereof other than such as are separately assessed in respect of the demised premises or any part thereof or of the building separately demised</w:t>
       </w:r>
     </w:p>
     <w:p>
       <w:pPr/>
       <w:r>
-        <w:t>charged imposed or levied upon the Lessor's property or upon any person having control thereof other than such as are separately assessed in respect of the demised premises or any part of the building separately demised</w:t>
+        <w:t>(iii) The Lessor will keep insured the building and the Lessor's fixtures therein and thereon against loss or damage by fire and such other risks as the Lessor shall deem desirable or expedient in some insurance office or with underwriters of repute at the election of the Superior Lessors and in case of destruction of or damage to the building or any part thereof from any cause covered by such insurance as to make the same unfit for habitation and use will lay out all monies received in respect of such insurance (other than for loss of rent and architects and surveyors' fees) in rebuilding and reinstating the same as soon as reasonably practicable</w:t>
       </w:r>
     </w:p>
     <w:p>
       <w:pPr/>
       <w:r>
-        <w:t>(iii) The Lessor will insure and keep insured the building and the Lessor's fixtures therein and thereon against loss or damage by fire and such other risks as the Lessor shall deem desirable or expedient in some insurance office or with underwriters of repute at the election of the Lessor and in case of destruction of or damage to the building or any part thereof from any cause covered by such insurance as to make the same unfit for habitation and use and will lay out all monies received in respect of such insurance (other than for loss of rent and architect's and surveyor's fees) in rebuilding and reinstating the same as soon as reasonably practicable</w:t>
-      </w:r>
-    </w:p>
-    <w:p>
-      <w:pPr/>
-      <w:r>
-        <w:t>(iv) The Lessor will in the event of the demised premises being destroyed or so damaged by any insured risk as to be rendered partially or wholly unfit for occupation and use and PROVIDED THAT in no case the insurance effected by the Lessor shall not have been vitiated or payment of the insurance moneys refused in whole or in part in consequence of some act or default on the part of the Lessee his family servants or agents then the rent hereby reserved or a proportionate part thereof according to the nature and extent of the injuries sustained shall forthwith cease and the demised premises shall have been restored and reinstated and as soon rendered fit for occupation and use and in case any dispute shall arise as to the amount of such proportionate part or the period during which such cesser or abatement of rent shall be allowed the matter shall be referred to the Lessor's Surveyor as a single arbitrator in accordance with the provisions of the Arbitration Act 1950 or any statutory modification or re-enactment thereof for the time being in force the rent shall cease to be payable until the</w:t>
+        <w:t>(iv) The Lessor will in the event of the demised premises being destroyed or so damaged by any insured risk as to be rendered partially or wholly unfit for occupation and use and PROVIDED THAT in such event the insurance effected by the Lessor shall not have been vitiated or payment of the insurance moneys refused in whole or in part in consequence of some act or default on the part of the Lessee his family servants or agents then the rent hereby reserved or a proportionate part thereof according to the nature and extent of the injuries sustained shall forthwith cease to be payable until the demised premises shall have been restored and reinstated and as soon rendered fit for occupation and use and in case any dispute shall arise as to the amount of such proportionate part or the period during which such cesser or abatement of rent shall be allowed the matter shall be referred to the Lessor's Surveyor as a single arbitrator in accordance with the provisions of the Arbitration Act 1950 or any statutory modification or re-enactment thereof for the time being in force</w:t>
       </w:r>
     </w:p>
     <w:p>
@@ -617,7 +611,7 @@
     <w:p>
       <w:pPr/>
       <w:r>
-        <w:t>(v) Without prejudice to the foregoing the Lessor will do or cause to be done all such works installations acts matters and things as may in the Lessor's absolute discretion be necessary or advisable for the proper maintenance safety and administration of the Lessor's property including in particular (but without prejudice to the generality of the foregoing) the appointment of managing or other agents surveyors and accountants and the payment of their proper fees in connection with the supervision and performance of the Lessor's covenants in this Clause contained and the employment and payment of such contractors agents or servants as the Lessor shall think necessary in and about the performance of the covenants and provisions of this Clause PROVIDED ALWAYS that the Lessor shall not be liable for any act or omission of any such contractors agents or servants in and about the performance of the said covenants and provisions or any of them or for failure to perform all or any of the said covenants if the Lessor shall forthwith have taken and continue to take all reasonable steps to secure the performance of the same</w:t>
+        <w:t>(v) Without prejudice to the foregoing the Lessor will do or cause to be done all such works installations acts matters and things as may in the Lessor's absolute discretion be necessary or advisable for the proper maintenance safety and administration of the Lessor's property including in particular (but without prejudice to the generality of the foregoing) the appointment of Managing or other agents surveyors and accountants and the payment of their proper fees in connection with the supervision and performance of the Lessor's covenants in this Clause contained and the employment and payment of such contractors agents or servants as the Lessor shall think necessary in and about the performance of the covenants and provisions of this Clause PROVIDED ALWAYS that the Lessor shall not be liable for any act or omission of any such contractors agents or servants in and about the performance of the said covenants and provisions or any of them or for failure to perform all or any of the said covenants if the Lessor shall forthwith have taken and continue to take all reasonable steps to secure the performance of the same</w:t>
       </w:r>
     </w:p>
     <w:p>
@@ -629,7 +623,7 @@
     <w:p>
       <w:pPr/>
       <w:r>
-        <w:t>(vii) Save insofar as the cost thereof may be proportionately payable by the Lessee in accordance with their covenants in this Underlease contained the Lessor will be exclusively responsible for compliance with the covenants contained in the following Clauses of the Licence: 2 (4), 2 (5), 2 (7), (ii), 2 (8), 2 (9), 2 (10), 2 (12); and also (save as aforesaid) will be so responsible in respect of the obligations imposed by paragraph 3 of the Schedule to the Licence</w:t>
+        <w:t>(vii) Save insofar as the cost thereof may be proportionately payable by the Lessee in accordance with their covenants in this Underlease contained the Lessor will be exclusively responsible for compliance with the covenants contained in the following Clauses of the Licence: 2 (4), 2 (5), 2 (7), (ii), 2 (8), 2 (9), 2 (10), 2 (12), and also (save as aforesaid) will be so responsible in respect of the obligations imposed by paragraph 3 of the Schedule to the Licence</w:t>
       </w:r>
     </w:p>
     <w:p>
@@ -646,7 +640,7 @@
     <w:p>
       <w:pPr/>
       <w:r>
-        <w:t>and the service charge and performing and observing the covenants agreements and obligations hereinbefore contained and on his part to be observed and performed shall and may the Lessee quietly enjoy the demised premises and the rights set out in the said Second Schedule during the said term without any interruption of the Lessor or any person claiming through or in trust for the Lessor</w:t>
+        <w:t>and the service charge and performing and observing the covenants agreements and obligations hereinbefore contained and on his part to be observed and performed the Lessee shall and may quietly enjoy the demised premises and the rights set out in the said Second Schedule during the said term without any interruption by the Lessor or any person claiming through or in trust for the Lessor</w:t>
       </w:r>
     </w:p>
     <w:p>
@@ -682,7 +676,7 @@
     <w:p>
       <w:pPr/>
       <w:r>
-        <w:t>(d) Any moneys held on account of the service charge pursuant to Clause 3 (ii) (d) hereof which after the Lessor has parted with the</w:t>
+        <w:t>(ii) Any moneys held on account of the service charge pursuant to Clause 3 (ii) (d) hereof</w:t>
       </w:r>
     </w:p>
     <w:p>
@@ -693,13 +687,13 @@
     <w:p>
       <w:pPr/>
       <w:r>
-        <w:t>reversion shall be payable to the purchasers of the reversion or the duly authorised managing agents</w:t>
+        <w:t>which after the Lessor has parted with the reversion shall be payable to the purchasers of the reversion or their duly authorised managing agents</w:t>
       </w:r>
     </w:p>
     <w:p>
       <w:pPr/>
       <w:r>
-        <w:t>(ii) Nothing in this Underlease shall impose any obligation on the Lessor to provide or install any system or service not in existence at the date hereof</w:t>
+        <w:t>Nothing in this Underlease shall impose any obligation on the Lessor to provide or install any system or service not in existence at the date hereof</w:t>
       </w:r>
     </w:p>
     <w:p>
@@ -711,13 +705,13 @@
     <w:p>
       <w:pPr/>
       <w:r>
-        <w:t>6 Any Notice in writing Certificate or other document required or authorised to be given or served hereunder shall be sufficient although only addressed to the Lessee without his name or generally to the person interested without any name and notwithstanding that any person to be affected thereby is absent under disability or unascertained and shall be sufficiently given or served if it is left at the last known place of abode or business of the Lessee or other person to or upon whom it is to be given or served or is affixed or left on the demised premises</w:t>
+        <w:t>6 (a) Any Notice in writing Certificate or other document required or authorised to be given or served hereunder shall be sufficient although only addressed to the Lessee without his name or generally to the person interested without any name and notwithstanding that any person to be affected thereby is absent under disability or unascertained and shall be sufficiently given or served if it is left at the last known place of abode or business of the Lessee or other person to or upon whom it is to be given or served or is affixed or left on the demised premises</w:t>
       </w:r>
     </w:p>
     <w:p>
       <w:pPr/>
       <w:r>
-        <w:t>(b) Any such Notice in writing Certificate or other document as aforesaid shall also be sufficiently given or served if it is sent by ordinary post in a prepaid letter addressed to the person to or upon whom it is to be given or served by name at the aforesaid place of abode or business and if the same is not returned through the Post Office within seven days of posting it shall be deemed to have been received or served at the time at which it would in the ordinary course have been delivered</w:t>
+        <w:t>(b) Any such Notice in writing Certificate or other document as aforesaid shall also be sufficiently given or served if it is sent by ordinary post in a prepaid letter addressed to the person to or upon whom it is to be given or served by name at the aforesaid place of abode or business and if the same is not returned through the Post Office undelivered within seven days of posting it shall be deemed to have been received or served at the time at which it would in the ordinary course have been delivered</w:t>
       </w:r>
     </w:p>
     <w:p>
@@ -794,7 +788,7 @@
     <w:p>
       <w:pPr/>
       <w:r>
-        <w:t>(e) all fixtures fittings and apparatus and equipment in the maisonette</w:t>
+        <w:t>(e) all fixtures fittings and appurtenances and equipment in the maisonette</w:t>
       </w:r>
     </w:p>
     <w:p>
@@ -812,13 +806,13 @@
     <w:p>
       <w:pPr/>
       <w:r>
-        <w:t>Subject to the regulations hereinbefore in Clauses 4 (5) and 4 (6) referred to</w:t>
+        <w:t>Subject to the regulations hereinbefore in Clauses 4 (5) and 4 (8) referred to</w:t>
       </w:r>
     </w:p>
     <w:p>
       <w:pPr/>
       <w:r>
-        <w:t>1. The right in common with the</w:t>
+        <w:t>1. The right in common with the Lessor and the</w:t>
       </w:r>
     </w:p>
     <w:p>
@@ -829,43 +823,67 @@
     <w:p>
       <w:pPr/>
       <w:r>
-        <w:t>Lessor and the lessees and occupiers of other parts of the building of access to and from the demised premises over and along the stairways landings and other common parts of the building and the exterior staircase leading to and from the basement and for the purpose of identification edged green on the said plan annexed hereto</w:t>
+        <w:t>Lessees and occupiers of other parts of the building of access to and from the demised premises over and along the stairways landings and other common parts of the building and for the purpose of identification edged green on the said plan annexed hereto</w:t>
       </w:r>
     </w:p>
     <w:p>
       <w:pPr/>
       <w:r>
-        <w:t>2. All rights of passage and running of water soil gas and electricity in over and through the drains channels sewers pipes wires and conduits in over and upon the remainder of the Lessor's property as the same are now or may hereafter be enjoyed by the demised premises</w:t>
+        <w:t>The right of access to and from the basement thereto from Hornton Street aforesaid along the exterior staircase leading to the basement</w:t>
       </w:r>
     </w:p>
     <w:p>
       <w:pPr/>
       <w:r>
-        <w:t>3. The right to the free and uninterrupted support and protection now enjoyed by the demised premises</w:t>
+        <w:t>2. All rights of support and protection now enjoyed by the demised premises</w:t>
       </w:r>
     </w:p>
     <w:p>
       <w:pPr/>
       <w:r>
-        <w:t>4. The right to use and enjoy the garden at 20 Hornton Street aforesaid</w:t>
+        <w:t>3. The right to the free passage and running of water soil gas and electricity in over and through the drains channels sewers pipes wires and conduits in over or upon the remainder of the Lessor's property as the same are now or may hereafter be enjoyed</w:t>
       </w:r>
     </w:p>
     <w:p>
       <w:pPr/>
       <w:r>
-        <w:t>5. The right to access to and from the basement rubbish disposal and to use and enjoy the dustbin area for the purpose of disposing of household refuse in such position as specified from time to time by the Lessor the Lessee shall at all times keep clear the dustbin area</w:t>
+        <w:t>(i) to use and enjoy the garden</w:t>
       </w:r>
     </w:p>
     <w:p>
       <w:pPr/>
       <w:r>
-        <w:t>Subject to the Lessor's right at all times to enter into and upon the demised premises for the purpose of laying repairing or renewing or making good any connection to any drains channels sewers pipes wires ducts and conduits</w:t>
+        <w:t>(ii) to use and enjoy the dustbin area</w:t>
       </w:r>
     </w:p>
     <w:p>
       <w:pPr/>
       <w:r>
-        <w:t>All easements quasi-easements and rights of passage and running of water soil gas and electricity in over and through the drains channels sewers pipes wires and conduits in under the demised premises belonging to the Lessor and the other demised premises causing as little damage or inconvenience as possible and making good any damage done in the course of the exercise thereof</w:t>
+        <w:t>4. The right to dispose of household refuse in the dustbin</w:t>
+      </w:r>
+    </w:p>
+    <w:p>
+      <w:pPr/>
+      <w:r>
+        <w:t>5. The right at all times to enter into and upon the Lessor's property for the purpose of laying repairing or renewing or making good any connection to any drains channels sewers pipes wires ducts and conduits</w:t>
+      </w:r>
+    </w:p>
+    <w:p>
+      <w:pPr/>
+      <w:r>
+        <w:t>All easements quasi-easements and rights of water soil gas and electricity in over and through the drains channels sewers pipes wires and conduits in over or upon the Lessor's property as are necessary for the proper performance of the Lessee's obligations thereunder the Lessee consenting subject to the Lessor being entitled from time to time to specify the position of such drains channels sewers pipes wires and conduits the Lessee shall at all times keep clear the dustbin</w:t>
+      </w:r>
+    </w:p>
+    <w:p>
+      <w:pPr/>
+      <w:r>
+        <w:t>All easements powers pipes wires in over or upon the demised premises belonging to the Lessor and the demised premises</w:t>
+      </w:r>
+    </w:p>
+    <w:p>
+      <w:pPr/>
+      <w:r>
+        <w:t>Rights and matters of like nature and the right of the Lessor from time to time to exercise thereof causing as little damage and inconvenience as possible</w:t>
       </w:r>
     </w:p>
     <w:p>
@@ -877,13 +895,7 @@
     <w:p>
       <w:pPr/>
       <w:r>
-        <w:t>The covenants and conditions subject to which the demise is made</w:t>
-      </w:r>
-    </w:p>
-    <w:p>
-      <w:pPr/>
-      <w:r>
-        <w:t>for the proper performance of the Lessee's obligations</w:t>
+        <w:t>The conditions to which the demise is made subject</w:t>
       </w:r>
     </w:p>
     <w:p>

</xml_diff>

<commit_message>
Minor refinement to sublease page 17 from late review agent
https://claude.ai/code/session_01BKUuQUqscRFSnXdaV7eTvz
</commit_message>
<xml_diff>
--- a/output/20 Hornton Street Flat 1 Sublease to Newnhams -- 1973.docx
+++ b/output/20 Hornton Street Flat 1 Sublease to Newnhams -- 1973.docx
@@ -640,13 +640,13 @@
     <w:p>
       <w:pPr/>
       <w:r>
-        <w:t>and the service charge and performing and observing the covenants agreements and obligations hereinbefore contained and on his part to be observed and performed the Lessee shall and may quietly enjoy the demised premises and the rights set out in the said Second Schedule during the said term without any interruption by the Lessor or any person claiming through or in trust for the Lessor</w:t>
+        <w:t>and the service charge and performing the covenants hereinbefore contained and on his part to be observed and performed shall and may quietly enjoy the demised premises and the rights set out in the said Second Schedule during the said term without any interruption of the Lessor or any person claiming through or in trust for the Lessor</w:t>
       </w:r>
     </w:p>
     <w:p>
       <w:pPr/>
       <w:r>
-        <w:t>PROVIDED further and it is hereby agreed as follows:</w:t>
+        <w:t>6. IT IS FURTHER PROVIDED and it is hereby agreed as follows:</w:t>
       </w:r>
     </w:p>
     <w:p>
@@ -670,13 +670,13 @@
     <w:p>
       <w:pPr/>
       <w:r>
-        <w:t>(c) any loss or damage or interference or annoyance suffered by the Lessee during the carrying out by the Lessor or the Superior Lessors of repairs decorations additions alterations or other works whether structural or otherwise which may appear to the Lessor to be necessary or desirable to the demised premises or to the building or to any other part of the Lessor's or any other property of the Superior Lessors provided the same (so far as they are done by or on behalf of the Lessor) are carried out with reasonable skill and care</w:t>
+        <w:t>(c) any loss or damage or interference or annoyance suffered by the Lessee during the carrying out by the Lessor or the Superior Lessors of repairs decorations additions alterations or other works whether structural or otherwise which may appear to the Lessor to be necessary or desirable to the demised premises or to the building or to any other part of the Lessor's property or any other property of the Superior Lessors provided the same (so far as they are done by or on behalf of the Lessor) are carried out with reasonable skill and care</w:t>
       </w:r>
     </w:p>
     <w:p>
       <w:pPr/>
       <w:r>
-        <w:t>(ii) Any moneys held on account of the service charge pursuant to Clause 3 (ii) (d) hereof</w:t>
+        <w:t>(d) any moneys held on account of the service charge pursuant to Clause 3 (ii) (d) hereof which after the Lessor has parted with the</w:t>
       </w:r>
     </w:p>
     <w:p>
@@ -687,13 +687,13 @@
     <w:p>
       <w:pPr/>
       <w:r>
-        <w:t>which after the Lessor has parted with the reversion shall be payable to the purchasers of the reversion or their duly authorised managing agents</w:t>
+        <w:t>reversion shall have been duly paid over and become payable to the purchasers of the reversion or their duly authorised managing agents</w:t>
       </w:r>
     </w:p>
     <w:p>
       <w:pPr/>
       <w:r>
-        <w:t>Nothing in this Underlease shall impose any obligation on the Lessor to provide or install any system or service not in existence at the date hereof</w:t>
+        <w:t>(ii) Nothing in this Underlease shall impose any obligation on the Lessor to provide or install any system or service not in existence at the date hereof</w:t>
       </w:r>
     </w:p>
     <w:p>
@@ -705,13 +705,13 @@
     <w:p>
       <w:pPr/>
       <w:r>
-        <w:t>6 (a) Any Notice in writing Certificate or other document required or authorised to be given or served hereunder shall be sufficient although only addressed to the Lessee without his name or generally to the person interested without any name and notwithstanding that any person to be affected thereby is absent under disability or unascertained and shall be sufficiently given or served if it is left at the last known place of abode or business of the Lessee or other person to or upon whom it is to be given or served or is affixed or left on the demised premises</w:t>
+        <w:t>7. (a) Any Notice in writing Certificate or other document required or authorised to be given or served hereunder shall be sufficient although only addressed to the Lessee without his name or generally to the person interested without any name and notwithstanding that any person to be affected thereby is absent under disability or unascertained and shall be sufficiently given or served if it is left at the last known place of abode or business of the Lessee or other person to or upon whom it is to be given or served or is affixed or left on the demised premises</w:t>
       </w:r>
     </w:p>
     <w:p>
       <w:pPr/>
       <w:r>
-        <w:t>(b) Any such Notice in writing Certificate or other document as aforesaid shall also be sufficiently given or served if it is sent by ordinary post in a prepaid letter addressed to the person to or upon whom it is to be given or served by name at the aforesaid place of abode or business and if the same is not returned through the Post Office undelivered within seven days of posting it shall be deemed to have been received or served at the time at which it would in the ordinary course have been delivered</w:t>
+        <w:t>(b) Any such Notice in writing Certificate or other document as aforesaid shall also be sufficiently given or served if it is sent by ordinary post in a prepaid letter addressed to the person to or upon whom it is to be given or served by name at the aforesaid place of abode or business and if the same is not returned through the Post Office within seven days of posting it shall be deemed to have been received or served at the time at which it would in the ordinary course have been delivered</w:t>
       </w:r>
     </w:p>
     <w:p>
@@ -740,7 +740,7 @@
     <w:p>
       <w:pPr/>
       <w:r>
-        <w:t>FIRST SCHEDULE</w:t>
+        <w:t>THE FIRST SCHEDULE</w:t>
       </w:r>
     </w:p>
     <w:p>
@@ -752,7 +752,7 @@
     <w:p>
       <w:pPr/>
       <w:r>
-        <w:t>ALL THAT self-contained residential maisonette known as Flat 2 20 Hornton Street in the London Borough of Kensington and Chelsea situate at and comprising part of the ground floor and part of the basement of the building with the staircase within the demised premises linking the said parts of the said floors and shown for the purpose of identification only edged red on the plan annexed hereto together with the rear patio which is for the purpose of identification only shown edged and hatched red on the said plan but so that such further demise shall not be deemed to extend to or include the boundary walls and fences (if any) of the patio</w:t>
+        <w:t>ALL THAT self-contained residential maisonette known as Flat 1, 20 Hornton Street in the London Borough of Kensington &amp; Chelsea situate at and comprising part of the ground floor and part of the basement of the building with the staircase within the demised premises linking the said parts of the said floors and shown for the purpose of identification only edged red on the plan annexed hereto together with the rear patio which is for the purpose of identification only shown edged and hatched red on the said plan but so that such further demise shall not be deemed to extend to or include the boundary walls and fences (if any) of the patio</w:t>
       </w:r>
     </w:p>
     <w:p>
@@ -788,7 +788,7 @@
     <w:p>
       <w:pPr/>
       <w:r>
-        <w:t>(e) all fixtures fittings and appurtenances and equipment in the maisonette</w:t>
+        <w:t>(e) all fixtures fittings apparatus and equipment in the maisonette</w:t>
       </w:r>
     </w:p>
     <w:p>
@@ -806,13 +806,7 @@
     <w:p>
       <w:pPr/>
       <w:r>
-        <w:t>Subject to the regulations hereinbefore in Clauses 4 (5) and 4 (8) referred to</w:t>
-      </w:r>
-    </w:p>
-    <w:p>
-      <w:pPr/>
-      <w:r>
-        <w:t>1. The right in common with the Lessor and the</w:t>
+        <w:t>1. The right in common with</w:t>
       </w:r>
     </w:p>
     <w:p>

</xml_diff>

<commit_message>
Final sublease refinements from comprehensive review agent
Improved pages 18-25 with better text recovery, especially
on the Schedules and signature pages.

https://claude.ai/code/session_01BKUuQUqscRFSnXdaV7eTvz
</commit_message>
<xml_diff>
--- a/output/20 Hornton Street Flat 1 Sublease to Newnhams -- 1973.docx
+++ b/output/20 Hornton Street Flat 1 Sublease to Newnhams -- 1973.docx
@@ -817,79 +817,55 @@
     <w:p>
       <w:pPr/>
       <w:r>
-        <w:t>Lessees and occupiers of other parts of the building of access to and from the demised premises over and along the stairways landings and other common parts of the building and for the purpose of identification edged green on the said plan annexed hereto</w:t>
+        <w:t>the Lessor and the Lessees and occupiers of other parts of the building and all persons authorised by them of access to and egress from the demised premises over and along the stairways landings and other common parts of the building and the exterior staircase leading to and from the basement for the purpose of access to and entry upon the demised premises</w:t>
       </w:r>
     </w:p>
     <w:p>
       <w:pPr/>
       <w:r>
-        <w:t>The right of access to and from the basement thereto from Hornton Street aforesaid along the exterior staircase leading to the basement</w:t>
+        <w:t>2. All rights of passage and running of water soil gas and electricity in over and through the drains channels sewers pipes wires ducts and conduits in over or upon the remainder of the Lessor's property as the same are now or hereafter to be enjoyed by the demised premises</w:t>
       </w:r>
     </w:p>
     <w:p>
       <w:pPr/>
       <w:r>
-        <w:t>2. All rights of support and protection now enjoyed by the demised premises</w:t>
+        <w:t>3. The right to the free and uninterrupted support and protection now enjoyed by the demised premises</w:t>
       </w:r>
     </w:p>
     <w:p>
       <w:pPr/>
       <w:r>
-        <w:t>3. The right to the free passage and running of water soil gas and electricity in over and through the drains channels sewers pipes wires and conduits in over or upon the remainder of the Lessor's property as the same are now or may hereafter be enjoyed</w:t>
+        <w:t>4. The right to use and enjoy the garden in Hornton Street aforesaid subject to the provisions thereunder the Lessee consenting to the Lessor's possession and disposition thereof</w:t>
       </w:r>
     </w:p>
     <w:p>
       <w:pPr/>
       <w:r>
-        <w:t>(i) to use and enjoy the garden</w:t>
+        <w:t>5. The right to dispose of household refuse in the dustbin store in the basement</w:t>
       </w:r>
     </w:p>
     <w:p>
       <w:pPr/>
       <w:r>
-        <w:t>(ii) to use and enjoy the dustbin area</w:t>
+        <w:t>THE THIRD SCHEDULE</w:t>
       </w:r>
     </w:p>
     <w:p>
       <w:pPr/>
       <w:r>
-        <w:t>4. The right to dispose of household refuse in the dustbin</w:t>
+        <w:t>Rights and matters to which the demise is made subject</w:t>
       </w:r>
     </w:p>
     <w:p>
       <w:pPr/>
       <w:r>
-        <w:t>5. The right at all times to enter into and upon the Lessor's property for the purpose of laying repairing or renewing or making good any connection to any drains channels sewers pipes wires ducts and conduits</w:t>
+        <w:t>1. All easements quasi-easements and rights of light drainage and other rights enjoyed by other parts of the Lessor's property or any adjacent property of the Superior Lessors the Lessor and the owners and occupiers of other parts of the Lessor's property and any adjacent property whether now existing or hereafter granted by this Underlease or the Head Lease relating to other demised premises</w:t>
       </w:r>
     </w:p>
     <w:p>
       <w:pPr/>
       <w:r>
-        <w:t>All easements quasi-easements and rights of water soil gas and electricity in over and through the drains channels sewers pipes wires and conduits in over or upon the Lessor's property as are necessary for the proper performance of the Lessee's obligations thereunder the Lessee consenting subject to the Lessor being entitled from time to time to specify the position of such drains channels sewers pipes wires and conduits the Lessee shall at all times keep clear the dustbin</w:t>
-      </w:r>
-    </w:p>
-    <w:p>
-      <w:pPr/>
-      <w:r>
-        <w:t>All easements powers pipes wires in over or upon the demised premises belonging to the Lessor and the demised premises</w:t>
-      </w:r>
-    </w:p>
-    <w:p>
-      <w:pPr/>
-      <w:r>
-        <w:t>Rights and matters of like nature and the right of the Lessor from time to time to exercise thereof causing as little damage and inconvenience as possible</w:t>
-      </w:r>
-    </w:p>
-    <w:p>
-      <w:pPr/>
-      <w:r>
-        <w:t>THIRD SCHEDULE</w:t>
-      </w:r>
-    </w:p>
-    <w:p>
-      <w:pPr/>
-      <w:r>
-        <w:t>The conditions to which the demise is made subject</w:t>
+        <w:t>2. The right of the Lessor and the Superior Lessors and their agents for the purpose of laying repairing or renewing or making good any connection to any drains channels sewers pipes wires ducts and conduits in over under or through the demised premises and the power to enter into and upon the demised premises for the proper performance of the Lessor's obligations and the exercise of any rights in the Lessor's property whether by this Underlease or hereafter granted causing as little damage or inconvenience as possible and making good any damage done in the course of the exercise thereof</w:t>
       </w:r>
     </w:p>
     <w:p>
@@ -900,97 +876,49 @@
     <w:p>
       <w:pPr/>
       <w:r>
-        <w:t>FOURTH SCHEDULE (Restrictions and Regulations)</w:t>
+        <w:t>THE FOURTH SCHEDULE</w:t>
       </w:r>
     </w:p>
     <w:p>
       <w:pPr/>
       <w:r>
-        <w:t>[ILLEGIBLE - original scan quality too poor for OCR]</w:t>
+        <w:t>Restrictions and regulations</w:t>
       </w:r>
     </w:p>
     <w:p>
       <w:pPr/>
       <w:r>
-        <w:t>[The following fragments are partially recoverable from the scan:]</w:t>
+        <w:t>1. No piano organ record player television wireless loudspeaker or other musical or mechanical instrument of any description shall be played or used nor shall any singing or the practice of any musical instrument be practised in or on the demised premises so as to be audible outside the demised premises between the hours of 11 p.m. and 8 a.m. or at any time so as to cause annoyance to the owners lessees or occupiers of any other part of the Lessor's property</w:t>
       </w:r>
     </w:p>
     <w:p>
       <w:pPr/>
       <w:r>
-        <w:t>1. [Partial text regarding restrictions on the demised premises]</w:t>
+        <w:t>2. Not (except for the proper use of a waste disposal unit (if any) in the kitchen) to throw dirt rubbish refuse or permit the same to be thrown into fixed sinks baths lavatories cisterns or soil pipes in the demised premises</w:t>
       </w:r>
     </w:p>
     <w:p>
       <w:pPr/>
       <w:r>
-        <w:t>2. [Partial text regarding reservations under the Lease]</w:t>
+        <w:t>3. No flower box or other like object shall be placed on the exterior of the demised premises or on any window sill or shutter of the windows of the demised premises without the written consent of the Lessor</w:t>
       </w:r>
     </w:p>
     <w:p>
       <w:pPr/>
       <w:r>
-        <w:t>3. Not to obstruct or interfere with the Lessor's property.</w:t>
+        <w:t>4. No bird dog cat or other animal which in the opinion of the Lessor may cause annoyance to any owners lessees or occupiers of any other part of the Lessor's property shall be kept in the demised premises</w:t>
       </w:r>
     </w:p>
     <w:p>
       <w:pPr/>
       <w:r>
-        <w:t>4. [Partial text regarding power and rights]</w:t>
+        <w:t>5. No interference with the light or air to the demised premises or to any other part of the Lessor's property as are excepted and reserved by the Superior Lessors the Lessor and the owners and occupiers of other parts of the Lessor's property</w:t>
       </w:r>
     </w:p>
     <w:p>
       <w:pPr/>
       <w:r>
-        <w:t>5. No audible outside the demised premises [partial text regarding noise restrictions].</w:t>
-      </w:r>
-    </w:p>
-    <w:p>
-      <w:pPr/>
-      <w:r>
-        <w:t>6. No record player television wireless loudspeaker or other musical or other mechanical instrument of any kind shall be played or used nor shall any music be practised in or on the demised premises so as to be audible outside the demised premises between the hours of [ILLEGIBLE] at any time so as to cause nuisance or annoyance to the owners lessees or occupiers of the remainder of the Lessor's property.</w:t>
-      </w:r>
-    </w:p>
-    <w:p>
-      <w:pPr/>
-      <w:r>
-        <w:t>7. Not (except for the proper use of a disposal unit (if any)) to throw dirt rubbish or refuse or permit the same to be thrown into baths lavatories cisterns or sinks or to put or deposit waste or other matter into fixed sinks or soil pipes in the demised premises.</w:t>
-      </w:r>
-    </w:p>
-    <w:p>
-      <w:pPr/>
-      <w:r>
-        <w:t>8. No flower box or other object shall be placed on the exterior of the demised premises or on any window of the demised premises without the written consent of the Lessor.</w:t>
-      </w:r>
-    </w:p>
-    <w:p>
-      <w:pPr/>
-      <w:r>
-        <w:t>9. Not to cause any interference with the rights to the demised premises as are excepted and reserved to the Superior Lessors the Lessor and the owners and occupiers of other parts of the Lessor's property whether by the Lease or by this Underlease or the Lease relating to other premises whether now existing or hereafter granted.</w:t>
-      </w:r>
-    </w:p>
-    <w:p>
-      <w:pPr/>
-      <w:r>
-        <w:t>10. Not to alter any part of the adjacent property of the Lessor.</w:t>
-      </w:r>
-    </w:p>
-    <w:p>
-      <w:pPr/>
-      <w:r>
-        <w:t>11. [Partial text regarding restrictions]</w:t>
-      </w:r>
-    </w:p>
-    <w:p>
-      <w:pPr/>
-      <w:r>
-        <w:t>12. No bird dog cat or other animal which in the opinion of the Lessor may cause annoyance shall be kept in the demised premises without the written consent of the Lessor.</w:t>
-      </w:r>
-    </w:p>
-    <w:p>
-      <w:pPr/>
-      <w:r>
-        <w:t>13. [Partial text regarding items not to be shaken out of the windows or placed in the garden or basement areas and restrictions on animals on any other part of the Lessor's property.]</w:t>
+        <w:t>6. No dog belonging to the Lessee shall be exercised on the grounds of the Lessor's property other than the demised premises and to keep any such dog on a lead whilst within the curtilage of the Lessor's property except as aforesaid</w:t>
       </w:r>
     </w:p>
     <w:p>
@@ -1001,49 +929,49 @@
     <w:p>
       <w:pPr/>
       <w:r>
-        <w:t>14. No external wireless or television aerial shall be erected in on or connected with the demised premises without the written consent of the Lessor first obtained.</w:t>
+        <w:t>7. No external wireless or television aerial shall be erected in on or connected with the demised premises without the written consent of the Lessor first obtained</w:t>
       </w:r>
     </w:p>
     <w:p>
       <w:pPr/>
       <w:r>
-        <w:t>15. No name writing drawing signboard plate or placard of any kind shall be put on or in any windows of the demised premises or on or in any other part of the demised premises so as to be visible from outside the demised premises.</w:t>
+        <w:t>8. No name writing drawing signboard plate or placard of any kind shall be put on or in any windows of the demised premises or on or in any other part of the demised premises so as to be visible from outside the demised premises</w:t>
       </w:r>
     </w:p>
     <w:p>
       <w:pPr/>
       <w:r>
-        <w:t>16. No clothes linen bathing costumes or other articles shall be hung up or placed on any part of the demised premises so as to be visible from any other part of the Lessor's property or any adjoining or neighbouring streets or houses.</w:t>
+        <w:t>9. No clothes linen bathing costumes or other articles shall be hung up or placed on any part of the demised premises so as to be visible from any other part of the Lessor's property or any adjoining or neighbouring streets or houses</w:t>
       </w:r>
     </w:p>
     <w:p>
       <w:pPr/>
       <w:r>
-        <w:t>17. No unsuppressed electrical equipment or appliances shall at any time be used in or upon the demised premises or any part thereof.</w:t>
+        <w:t>10. No unsuppressed electrical equipment or appliances shall at any time be used in or upon the demised premises or any part thereof</w:t>
       </w:r>
     </w:p>
     <w:p>
       <w:pPr/>
       <w:r>
-        <w:t>18. The Lessee shall not in any way encumber or interfere or suffer or permit any encumbrance or interference with the access to or egress from any part of the Lessor's property not hereby demised or allow any cycles perambulator car bathchair invalid carriage or other vehicle or thing or any goods package or rubbish to be placed or remain upon any part of the Lessor's property not hereby demised save as is hereinbefore in the Second Schedule expressly permitted.</w:t>
+        <w:t>11. The Lessee shall not in any way encumber or interfere or suffer or permit any encumbrance or interference with the access to or egress from any part of the Lessor's property not hereby demised or allow any cycles perambulator car bathchair invalid carriage or other vehicle or thing or any goods package or rubbish to be placed or remain upon any part of the Lessor's property not hereby demised save as is hereinbefore in the Second Schedule expressly permitted</w:t>
       </w:r>
     </w:p>
     <w:p>
       <w:pPr/>
       <w:r>
-        <w:t>19. The Lessee shall not permit any water or liquid to escape from the demised premises and in the event of such happening (without prejudice to the Lessor's rights under this Underlease or otherwise) the Lessee shall immediately rectify and make good said damage and injury thereby occasioned.</w:t>
+        <w:t>12. The Lessee shall not permit any water or liquid to escape from the demised premises and in the event of such happening (without prejudice to the Lessor's rights under this Underlease or otherwise) the Lessee shall immediately rectify and make good said damage and injury thereby occasioned</w:t>
       </w:r>
     </w:p>
     <w:p>
       <w:pPr/>
       <w:r>
-        <w:t>20. The exterior of the demised premises shall not be decorated otherwise than by the Lessor.</w:t>
+        <w:t>13. The exterior of the demised premises shall not be decorated otherwise than by the Lessor</w:t>
       </w:r>
     </w:p>
     <w:p>
       <w:pPr/>
       <w:r>
-        <w:t>21. Not to allow any dog belonging to the Lessee to be exercised on the grounds of the Lessor's property other than the demised premises and to keep any such dog on a lead whilst within the curtilage of the Lessor's property except as aforesaid.</w:t>
+        <w:t>14. Not to allow any dog belonging to the Lessee to be exercised on the grounds of the Lessor's property other than the demised premises and to keep any such dog on a lead whilst within the curtilage of the Lessor's property except as aforesaid</w:t>
       </w:r>
     </w:p>
     <w:p>
@@ -1054,91 +982,49 @@
     <w:p>
       <w:pPr/>
       <w:r>
-        <w:t>FIFTH SCHEDULE (Expenses in respect of which Service Charge is payable)</w:t>
+        <w:t>THE FIFTH SCHEDULE</w:t>
       </w:r>
     </w:p>
     <w:p>
       <w:pPr/>
       <w:r>
-        <w:t>[ILLEGIBLE - original scan quality too poor for OCR]</w:t>
+        <w:t>The heads of the Lessor's expenditure</w:t>
       </w:r>
     </w:p>
     <w:p>
       <w:pPr/>
       <w:r>
-        <w:t>[The following fragments are partially recoverable from the scan:]</w:t>
+        <w:t>1. The fees of the Lessor and the Superior Lessors and their agents for the management of the building and for the collection of the rents of the premises under flats in the building and for the performance and enforcement thereof</w:t>
       </w:r>
     </w:p>
     <w:p>
       <w:pPr/>
       <w:r>
-        <w:t>1. Repairing maintaining rebuilding and renewing and keeping in good and substantial repair and condition all the structure of the building and all the parts thereof.</w:t>
+        <w:t>2. All fees and costs incurred in respect of the Certificate and of accounts rent and audits made for the purpose thereof</w:t>
       </w:r>
     </w:p>
     <w:p>
       <w:pPr/>
       <w:r>
-        <w:t>2. Painting redecorating and colouring the exterior and all the common parts of the building and fittings thereunto.</w:t>
+        <w:t>3. Any amount which the Lessor shall be called upon to pay as a contribution towards the expense of making repairing maintaining rebuilding and cleansing all pavements sewers drains pipes gutters watercourses party walls party structures party fences walls or other conveniences which may belong to or be used for the Lessor's property in common with other premises near or adjoining thereto</w:t>
       </w:r>
     </w:p>
     <w:p>
       <w:pPr/>
       <w:r>
-        <w:t>3. [Partial text regarding clause references]</w:t>
+        <w:t>4. The cost of maintaining repairing and renewing the television and radio receiving aerials (if any) installed on the building and/or any rent therefor</w:t>
       </w:r>
     </w:p>
     <w:p>
       <w:pPr/>
       <w:r>
-        <w:t>4. Inspecting maintaining repairing and where necessary replacing all plant apparatus and equipment for domestic hot water supply and any such services.</w:t>
+        <w:t>5. All costs and expenses incurred by the Lessor in complying with his covenants under the Head Lease and Licence except those incurred in carrying out the works of conversion permitted by the Licence</w:t>
       </w:r>
     </w:p>
     <w:p>
       <w:pPr/>
       <w:r>
-        <w:t>5. [Partial text regarding insurance]</w:t>
-      </w:r>
-    </w:p>
-    <w:p>
-      <w:pPr/>
-      <w:r>
-        <w:t>6. [Partial text regarding insurance of the building and other apparatus and equipment]</w:t>
-      </w:r>
-    </w:p>
-    <w:p>
-      <w:pPr/>
-      <w:r>
-        <w:t>7. Carpeting cleaning [partial text regarding common areas].</w:t>
-      </w:r>
-    </w:p>
-    <w:p>
-      <w:pPr/>
-      <w:r>
-        <w:t>8. [Partial text regarding the Lessor's property used by others]</w:t>
-      </w:r>
-    </w:p>
-    <w:p>
-      <w:pPr/>
-      <w:r>
-        <w:t>9. The cost of maintaining the Lessor's property used for the Lessor's property including common parts landings and the building enjoyed by others or used by occupiers of the building.</w:t>
-      </w:r>
-    </w:p>
-    <w:p>
-      <w:pPr/>
-      <w:r>
-        <w:t>10. Rates assessments and other parliamentary or local charges in respect of any other matters.</w:t>
-      </w:r>
-    </w:p>
-    <w:p>
-      <w:pPr/>
-      <w:r>
-        <w:t>11. [Partial text regarding electricity or other fuel, water, and other services]</w:t>
-      </w:r>
-    </w:p>
-    <w:p>
-      <w:pPr/>
-      <w:r>
-        <w:t>12. [ILLEGIBLE - remainder of schedule]</w:t>
+        <w:t>6. The cost of taking all steps deemed desirable or expedient by the Lessor for complying with making representations against or otherwise contesting the incidence of the provisions of any legislation or orders requirements thereunder concerning Town &amp; Country Planning Public Health Highways Streets Drainage or other matters relating or alleged to relate to the building for which the Lessee is not directly liable hereunder</w:t>
       </w:r>
     </w:p>
     <w:p>
@@ -1149,55 +1035,43 @@
     <w:p>
       <w:pPr/>
       <w:r>
-        <w:t>FIFTH SCHEDULE (continued)</w:t>
+        <w:t>7. The cost of redecorating maintaining and where necessary replacing all the common parts of the building enjoyed by the Lessee and the Lessees or occupiers of other parts of the building or used or enjoyed in common by others or used or enjoyed by the Lessor</w:t>
       </w:r>
     </w:p>
     <w:p>
       <w:pPr/>
       <w:r>
-        <w:t>The fees of the Lessor and the Superior Lessor (if any) and their agents for the management and collection of the rents of the flats and premises under the Lease in the building and for the performance and enforcement thereof.</w:t>
+        <w:t>8. All rates assessments taxes charges and other outgoings whether parliamentary parochial local or otherwise in respect of the Lessor's property used by the Lessee or any other part of the Lessor's property</w:t>
       </w:r>
     </w:p>
     <w:p>
       <w:pPr/>
       <w:r>
-        <w:t>All fees and costs incurred in respect of the building for the purpose thereof.</w:t>
+        <w:t>9. The cost of supplying any such domestic hot water gas electricity or other fuel as the Lessor shall from time to time provide</w:t>
       </w:r>
     </w:p>
     <w:p>
       <w:pPr/>
       <w:r>
-        <w:t>Any amount which the Lessor is required to pay as a contribution towards the expense of making repairing and cleansing all sewers drains pipes gutters watercourses party walls party structures party fences walls or other conveniences and property in common with other premises near or adjoining thereto which may belong to or be used for the Lessor's property.</w:t>
+        <w:t>10. The cost of insuring and keeping insured the building and the Lessor's fixtures and fittings therein against loss or damage by fire and such other risks as the Lessor shall deem desirable</w:t>
       </w:r>
     </w:p>
     <w:p>
       <w:pPr/>
       <w:r>
-        <w:t>The television and radio receiving aerials (if any) used or capable of being used by the Lessee in common as aforesaid.</w:t>
+        <w:t>11. All costs and expenses incurred in maintaining repairing cleansing and where necessary replacing all pipes wires drains channels sewers ducts and conduits in over under or through the Lessor's property</w:t>
       </w:r>
     </w:p>
     <w:p>
       <w:pPr/>
       <w:r>
-        <w:t>All costs and expenses incurred by the Lessor in complying with his covenants under the Head Lease and Licence including those incurred in carrying out the works of conversion permitted by the Licence.</w:t>
+        <w:t>12. The cost of carpeting cleaning and maintaining the common parts of the building including staircases landings passages and entrance halls</w:t>
       </w:r>
     </w:p>
     <w:p>
       <w:pPr/>
       <w:r>
-        <w:t>The cost of taking all steps deemed desirable or expedient by the Lessor for complying with or making representations against or otherwise contesting the incidence of the provisions of any legislation or orders requirements thereunder concerning Town and Country Planning, Public Health, Highways, Streets, Drainage or other matters relating or alleged to relate to the building for which the Lessee is not directly liable hereunder.</w:t>
-      </w:r>
-    </w:p>
-    <w:p>
-      <w:pPr/>
-      <w:r>
-        <w:t>The cost of maintaining repairing and renewing any equipment installed on the building and/or any rent therefor.</w:t>
-      </w:r>
-    </w:p>
-    <w:p>
-      <w:pPr/>
-      <w:r>
-        <w:t>A Certificate of accounts and audits made by the Lessor shall be called upon towards the expense of maintaining rebuilding and cleansing the Lessor's property.</w:t>
+        <w:t>13. The cost of the Lessor's obligations described in Clause 5 hereof and all the Lessor's expenditure in connection therewith</w:t>
       </w:r>
     </w:p>
     <w:p>
@@ -1208,37 +1082,19 @@
     <w:p>
       <w:pPr/>
       <w:r>
-        <w:t>EXECUTION PAGE</w:t>
+        <w:t>SIGNED SEALED AND DELIVERED</w:t>
       </w:r>
     </w:p>
     <w:p>
       <w:pPr/>
       <w:r>
-        <w:t>[ILLEGIBLE - original scan quality too poor for OCR]</w:t>
+        <w:t>In the presence of:</w:t>
       </w:r>
     </w:p>
     <w:p>
       <w:pPr/>
       <w:r>
-        <w:t>[The following fragments are partially recoverable from the scan:]</w:t>
-      </w:r>
-    </w:p>
-    <w:p>
-      <w:pPr/>
-      <w:r>
-        <w:t>IN WITNESS whereof the said parties hereto have hereunto set their hands and seals the day and year first above written.</w:t>
-      </w:r>
-    </w:p>
-    <w:p>
-      <w:pPr/>
-      <w:r>
-        <w:t>[Partial text - signatures and attestation largely illegible due to poor scan quality]</w:t>
-      </w:r>
-    </w:p>
-    <w:p>
-      <w:pPr/>
-      <w:r>
-        <w:t>[ILLEGIBLE - remainder of execution page including signatures, witnesses, and attestation clauses cannot be reliably recovered from the scan]</w:t>
+        <w:t>[Signature page]</w:t>
       </w:r>
     </w:p>
     <w:p>

</xml_diff>